<commit_message>
User manual: USBSID-Pico, multi SID, stereo and window width
Additions as tracked changes, accept or reject them in Word:

- New sections Multi SID, Stereo and USBSID-Pico.
- Packing: multi SID export to .sid (PSID v3/v4 or SID v5, panning,
  song lengths).
- ASID: multi SID messages, Alt-O cycles reSID, ASID and USBSID.
- Keys: F2/F3 on the startup screen, Ctrl-4 to Ctrl-9 and
  Ctrl-Shift-1/2/3 mute keys, Ctrl-F9, Ctrl-Shift-F9, Ctrl-F12.
- Noteworthy features, driver list, visualizers and options updated.

The table of contents is not updated (Update Field in Word), the PDF in
dist/documentation is not regenerated. I will leave that up to you @Chordian
</commit_message>
<xml_diff>
--- a/resources/user_manual.docx
+++ b/resources/user_manual.docx
@@ -3291,6 +3291,57 @@
       </w:r>
     </w:p>
     <w:p>
+      <w:pPr>
+        <w:pStyle w:val="ListParagraph"/>
+        <w:numPr>
+          <w:ilvl w:val="0"/>
+          <w:numId w:val="2"/>
+        </w:numPr>
+        <w:rPr>
+          <w:ins w:id="9001" w:author="LouD" w:date="2026-10-04T12:00:00Z"/>
+        </w:rPr>
+      </w:pPr>
+      <w:ins w:id="9002" w:author="LouD" w:date="2026-10-04T12:00:00Z">
+        <w:r>
+          <w:t xml:space="preserve">You can play on real SIDs with a USBSID-Pico board connected over USB, without MIDI. Every SID write is sent with its exact cycle timing, and you can use more than one board at the same time.</w:t>
+        </w:r>
+      </w:ins>
+    </w:p>
+    <w:p>
+      <w:pPr>
+        <w:pStyle w:val="ListParagraph"/>
+        <w:numPr>
+          <w:ilvl w:val="0"/>
+          <w:numId w:val="2"/>
+        </w:numPr>
+        <w:rPr>
+          <w:ins w:id="9003" w:author="LouD" w:date="2026-10-04T12:00:00Z"/>
+        </w:rPr>
+      </w:pPr>
+      <w:ins w:id="9004" w:author="LouD" w:date="2026-10-04T12:00:00Z">
+        <w:r>
+          <w:t xml:space="preserve">Driver 11 also comes in versions for 2, 3 or 4 SID chips, with three tracks for every SID.</w:t>
+        </w:r>
+      </w:ins>
+    </w:p>
+    <w:p>
+      <w:pPr>
+        <w:pStyle w:val="ListParagraph"/>
+        <w:numPr>
+          <w:ilvl w:val="0"/>
+          <w:numId w:val="2"/>
+        </w:numPr>
+        <w:rPr>
+          <w:ins w:id="9005" w:author="LouD" w:date="2026-10-04T12:00:00Z"/>
+        </w:rPr>
+      </w:pPr>
+      <w:ins w:id="9006" w:author="LouD" w:date="2026-10-04T12:00:00Z">
+        <w:r>
+          <w:t xml:space="preserve">The reSID emulation can play in stereo, with the panning of the SID file format v5, and packed tunes can be saved as SID v5 files.</w:t>
+        </w:r>
+      </w:ins>
+    </w:p>
+    <w:p>
       <w:r>
         <w:t>Of course, the editor and its drivers also have all the modern features you would expect these days, such as table index hotkeys, muting channels, both instruments and commands at the same time, adjustable hard restart, pulse and filter programs, inserting the next unused sequence, and a whole lot more.</w:t>
       </w:r>
@@ -3658,6 +3709,38 @@
     </w:p>
     <w:p>
       <w:pPr>
+        <w:rPr>
+          <w:ins w:id="9007" w:author="LouD" w:date="2026-10-04T12:00:00Z"/>
+        </w:rPr>
+      </w:pPr>
+      <w:ins w:id="9008" w:author="LouD" w:date="2026-10-04T12:00:00Z">
+        <w:r>
+          <w:t xml:space="preserve">The </w:t>
+        </w:r>
+        <w:r>
+          <w:rPr>
+            <w:i/>
+            <w:iCs/>
+          </w:rPr>
+          <w:t xml:space="preserve">Output</w:t>
+        </w:r>
+        <w:r>
+          <w:t xml:space="preserve"> field shows where the music plays: reSID, ASID or USBSID. The </w:t>
+        </w:r>
+        <w:r>
+          <w:rPr>
+            <w:i/>
+            <w:iCs/>
+          </w:rPr>
+          <w:t xml:space="preserve">Pan</w:t>
+        </w:r>
+        <w:r>
+          <w:t xml:space="preserve"> field shows where every SID plays in the stereo output of reSID (see Stereo below).</w:t>
+        </w:r>
+      </w:ins>
+    </w:p>
+    <w:p>
+      <w:pPr>
         <w:pStyle w:val="Heading2"/>
       </w:pPr>
       <w:bookmarkStart w:id="6" w:name="_Toc224371831"/>
@@ -4403,6 +4486,51 @@
       <w:r>
         <w:t>.</w:t>
       </w:r>
+      <w:ins w:id="9075" w:author="LouD" w:date="2026-10-04T12:00:00Z">
+        <w:r>
+          <w:t xml:space="preserve"> With a multi SID driver, use </w:t>
+        </w:r>
+        <w:r>
+          <w:rPr>
+            <w:b/>
+            <w:color w:val="003399"/>
+          </w:rPr>
+          <w:t xml:space="preserve">Ctrl+4</w:t>
+        </w:r>
+        <w:r>
+          <w:t xml:space="preserve"> to </w:t>
+        </w:r>
+        <w:r>
+          <w:rPr>
+            <w:b/>
+            <w:color w:val="003399"/>
+          </w:rPr>
+          <w:t xml:space="preserve">Ctrl+9</w:t>
+        </w:r>
+        <w:r>
+          <w:t xml:space="preserve"> and </w:t>
+        </w:r>
+        <w:r>
+          <w:rPr>
+            <w:b/>
+            <w:color w:val="003399"/>
+          </w:rPr>
+          <w:t xml:space="preserve">Ctrl+Shift+1</w:t>
+        </w:r>
+        <w:r>
+          <w:t xml:space="preserve"> to </w:t>
+        </w:r>
+        <w:r>
+          <w:rPr>
+            <w:b/>
+            <w:color w:val="003399"/>
+          </w:rPr>
+          <w:t xml:space="preserve">Ctrl+Shift+3</w:t>
+        </w:r>
+        <w:r>
+          <w:t xml:space="preserve"> for track 4 to 12.</w:t>
+        </w:r>
+      </w:ins>
     </w:p>
     <w:p>
       <w:pPr>
@@ -4892,6 +5020,18 @@
       </w:r>
     </w:p>
     <w:p>
+      <w:pPr>
+        <w:rPr>
+          <w:ins w:id="9009" w:author="LouD" w:date="2026-10-04T12:00:00Z"/>
+        </w:rPr>
+      </w:pPr>
+      <w:ins w:id="9010" w:author="LouD" w:date="2026-10-04T12:00:00Z">
+        <w:r>
+          <w:t xml:space="preserve">With a driver for more than one SID, there is a column of bars for every SID.</w:t>
+        </w:r>
+      </w:ins>
+    </w:p>
+    <w:p>
       <w:r>
         <w:t xml:space="preserve">In the image above, you can see that the gray color of the bottom filter bar is visible as the background color on voice one and two. This indicates that those voices are currently filtered while the third is not. How to control this depends on the player. In the default player, you can turn it on and off for voices </w:t>
       </w:r>
@@ -6429,6 +6569,30 @@
       </w:r>
     </w:p>
     <w:p>
+      <w:pPr>
+        <w:pStyle w:val="ListParagraph"/>
+        <w:numPr>
+          <w:ilvl w:val="0"/>
+          <w:numId w:val="1"/>
+        </w:numPr>
+        <w:rPr>
+          <w:ins w:id="9011" w:author="LouD" w:date="2026-10-04T12:00:00Z"/>
+        </w:rPr>
+      </w:pPr>
+      <w:ins w:id="9012" w:author="LouD" w:date="2026-10-04T12:00:00Z">
+        <w:r>
+          <w:rPr>
+            <w:b/>
+            <w:color w:val="003399"/>
+          </w:rPr>
+          <w:t xml:space="preserve">Driver 11 with 2, 3 or 4 SIDs</w:t>
+        </w:r>
+        <w:r>
+          <w:t xml:space="preserve"> - driver 11.05 for multiple SID chips, with three tracks per SID (see Multi SID below).</w:t>
+        </w:r>
+      </w:ins>
+    </w:p>
+    <w:p>
       <w:r>
         <w:t xml:space="preserve">It is also possible to change the driver in an existing source tune. To do this, first load the driver with </w:t>
       </w:r>
@@ -6458,6 +6622,400 @@
       <w:r>
         <w:t xml:space="preserve"> for sub versions of the same major version driver. You could import a driver 11 tune into driver 12, but you would then have to overhaul the tables.</w:t>
       </w:r>
+    </w:p>
+    <w:p>
+      <w:pPr>
+        <w:pStyle w:val="Heading2"/>
+        <w:rPr>
+          <w:ins w:id="9013" w:author="LouD" w:date="2026-10-04T12:00:00Z"/>
+        </w:rPr>
+      </w:pPr>
+      <w:ins w:id="9014" w:author="LouD" w:date="2026-10-04T12:00:00Z">
+        <w:r>
+          <w:t xml:space="preserve">Multi SID</w:t>
+        </w:r>
+      </w:ins>
+    </w:p>
+    <w:p>
+      <w:pPr>
+        <w:rPr>
+          <w:ins w:id="9015" w:author="LouD" w:date="2026-10-04T12:00:00Z"/>
+        </w:rPr>
+      </w:pPr>
+      <w:ins w:id="9016" w:author="LouD" w:date="2026-10-04T12:00:00Z">
+        <w:r>
+          <w:t xml:space="preserve">The drivers </w:t>
+        </w:r>
+        <w:r>
+          <w:rPr>
+            <w:i/>
+            <w:iCs/>
+          </w:rPr>
+          <w:t xml:space="preserve">sf2driver11_05_2sid.prg</w:t>
+        </w:r>
+        <w:r>
+          <w:t xml:space="preserve">, </w:t>
+        </w:r>
+        <w:r>
+          <w:rPr>
+            <w:i/>
+            <w:iCs/>
+          </w:rPr>
+          <w:t xml:space="preserve">sf2driver11_05_3sid.prg</w:t>
+        </w:r>
+        <w:r>
+          <w:t xml:space="preserve"> and </w:t>
+        </w:r>
+        <w:r>
+          <w:rPr>
+            <w:i/>
+            <w:iCs/>
+          </w:rPr>
+          <w:t xml:space="preserve">sf2driver11_05_4sid.prg</w:t>
+        </w:r>
+        <w:r>
+          <w:t xml:space="preserve"> are driver 11.05 for 2, 3 or 4 SID chips. Every SID has three tracks of its own: tracks 1 to 3 play on the first SID, tracks 4 to 6 on the second, 7 to 9 on the third and 10 to 12 on the fourth. The SIDs are placed at </w:t>
+        </w:r>
+        <w:r>
+          <w:rPr>
+            <w:rFonts w:ascii="Courier New" w:hAnsi="Courier New" w:cs="Courier New"/>
+          </w:rPr>
+          <w:t xml:space="preserve">$D400</w:t>
+        </w:r>
+        <w:r>
+          <w:t xml:space="preserve">, </w:t>
+        </w:r>
+        <w:r>
+          <w:rPr>
+            <w:rFonts w:ascii="Courier New" w:hAnsi="Courier New" w:cs="Courier New"/>
+          </w:rPr>
+          <w:t xml:space="preserve">$D420</w:t>
+        </w:r>
+        <w:r>
+          <w:t xml:space="preserve">, </w:t>
+        </w:r>
+        <w:r>
+          <w:rPr>
+            <w:rFonts w:ascii="Courier New" w:hAnsi="Courier New" w:cs="Courier New"/>
+          </w:rPr>
+          <w:t xml:space="preserve">$D440</w:t>
+        </w:r>
+        <w:r>
+          <w:t xml:space="preserve"> and </w:t>
+        </w:r>
+        <w:r>
+          <w:rPr>
+            <w:rFonts w:ascii="Courier New" w:hAnsi="Courier New" w:cs="Courier New"/>
+          </w:rPr>
+          <w:t xml:space="preserve">$D460</w:t>
+        </w:r>
+        <w:r>
+          <w:t xml:space="preserve">.</w:t>
+        </w:r>
+      </w:ins>
+    </w:p>
+    <w:p>
+      <w:pPr>
+        <w:rPr>
+          <w:ins w:id="9017" w:author="LouD" w:date="2026-10-04T12:00:00Z"/>
+        </w:rPr>
+      </w:pPr>
+      <w:ins w:id="9018" w:author="LouD" w:date="2026-10-04T12:00:00Z">
+        <w:r>
+          <w:t xml:space="preserve">Instruments, commands and all the other tables are shared by all SIDs. Every SID has its own filter, filter program and main volume.</w:t>
+        </w:r>
+      </w:ins>
+    </w:p>
+    <w:p>
+      <w:pPr>
+        <w:rPr>
+          <w:ins w:id="9019" w:author="LouD" w:date="2026-10-04T12:00:00Z"/>
+        </w:rPr>
+      </w:pPr>
+      <w:ins w:id="9020" w:author="LouD" w:date="2026-10-04T12:00:00Z">
+        <w:r>
+          <w:t xml:space="preserve">When you load a multi SID driver or tune, the window widens to make room for the extra tracks. It narrows again when you load a tune with fewer SIDs. Press </w:t>
+        </w:r>
+        <w:r>
+          <w:rPr>
+            <w:b/>
+            <w:color w:val="003399"/>
+          </w:rPr>
+          <w:t xml:space="preserve">Ctrl+F12</w:t>
+        </w:r>
+        <w:r>
+          <w:t xml:space="preserve"> to step through the window widths for 1, 2, 3 and 4 SIDs; widths too narrow for the loaded driver are skipped. The window fades out and in like with </w:t>
+        </w:r>
+        <w:r>
+          <w:rPr>
+            <w:b/>
+            <w:color w:val="003399"/>
+          </w:rPr>
+          <w:t xml:space="preserve">F12</w:t>
+        </w:r>
+        <w:r>
+          <w:t xml:space="preserve">. Changing the width stops playback and clears the undo history.</w:t>
+        </w:r>
+      </w:ins>
+    </w:p>
+    <w:p>
+      <w:pPr>
+        <w:rPr>
+          <w:ins w:id="9021" w:author="LouD" w:date="2026-10-04T12:00:00Z"/>
+        </w:rPr>
+      </w:pPr>
+      <w:ins w:id="9022" w:author="LouD" w:date="2026-10-04T12:00:00Z">
+        <w:r>
+          <w:t xml:space="preserve">Use </w:t>
+        </w:r>
+        <w:r>
+          <w:rPr>
+            <w:b/>
+            <w:color w:val="003399"/>
+          </w:rPr>
+          <w:t xml:space="preserve">Ctrl+1</w:t>
+        </w:r>
+        <w:r>
+          <w:t xml:space="preserve"> to </w:t>
+        </w:r>
+        <w:r>
+          <w:rPr>
+            <w:b/>
+            <w:color w:val="003399"/>
+          </w:rPr>
+          <w:t xml:space="preserve">Ctrl+9</w:t>
+        </w:r>
+        <w:r>
+          <w:t xml:space="preserve"> to mute and unmute track 1 to 9, and </w:t>
+        </w:r>
+        <w:r>
+          <w:rPr>
+            <w:b/>
+            <w:color w:val="003399"/>
+          </w:rPr>
+          <w:t xml:space="preserve">Ctrl+Shift+1</w:t>
+        </w:r>
+        <w:r>
+          <w:t xml:space="preserve">, </w:t>
+        </w:r>
+        <w:r>
+          <w:rPr>
+            <w:b/>
+            <w:color w:val="003399"/>
+          </w:rPr>
+          <w:t xml:space="preserve">Ctrl+Shift+2</w:t>
+        </w:r>
+        <w:r>
+          <w:t xml:space="preserve"> and </w:t>
+        </w:r>
+        <w:r>
+          <w:rPr>
+            <w:b/>
+            <w:color w:val="003399"/>
+          </w:rPr>
+          <w:t xml:space="preserve">Ctrl+Shift+3</w:t>
+        </w:r>
+        <w:r>
+          <w:t xml:space="preserve"> for track 10 to 12.</w:t>
+        </w:r>
+      </w:ins>
+    </w:p>
+    <w:p>
+      <w:pPr>
+        <w:rPr>
+          <w:ins w:id="9023" w:author="LouD" w:date="2026-10-04T12:00:00Z"/>
+        </w:rPr>
+      </w:pPr>
+      <w:ins w:id="9024" w:author="LouD" w:date="2026-10-04T12:00:00Z">
+        <w:r>
+          <w:t xml:space="preserve">reSID emulates every SID and mixes them. USBSID-Pico plays every SID of the tune on its own SID chip, and ASID sends every SID to the MIDI device (see ASID and USBSID-Pico below).</w:t>
+        </w:r>
+      </w:ins>
+    </w:p>
+    <w:p>
+      <w:pPr>
+        <w:pStyle w:val="IntenseQuote"/>
+        <w:rPr>
+          <w:ins w:id="9025" w:author="LouD" w:date="2026-10-04T12:00:00Z"/>
+        </w:rPr>
+      </w:pPr>
+      <w:ins w:id="9026" w:author="LouD" w:date="2026-10-04T12:00:00Z">
+        <w:r>
+          <w:rPr>
+            <w:b/>
+          </w:rPr>
+          <w:t>TIP:</w:t>
+        </w:r>
+        <w:r>
+          <w:t xml:space="preserve"> The SIDs are added up. If a loud tune distorts, lower </w:t>
+        </w:r>
+        <w:r>
+          <w:rPr>
+            <w:i/>
+            <w:iCs/>
+          </w:rPr>
+          <w:t xml:space="preserve">Sound.Output.Gain</w:t>
+        </w:r>
+        <w:r>
+          <w:t xml:space="preserve"> in your </w:t>
+        </w:r>
+        <w:r>
+          <w:rPr>
+            <w:i/>
+            <w:iCs/>
+          </w:rPr>
+          <w:t xml:space="preserve">user.ini</w:t>
+        </w:r>
+        <w:r>
+          <w:t xml:space="preserve"> (0.5 for 2 SIDs and 0.25 for 4 SIDs are always safe). With 3 or 4 SIDs on the 6581 model, a slow computer may need a larger </w:t>
+        </w:r>
+        <w:r>
+          <w:rPr>
+            <w:i/>
+            <w:iCs/>
+          </w:rPr>
+          <w:t xml:space="preserve">Sound.Buffer.Size</w:t>
+        </w:r>
+        <w:r>
+          <w:t xml:space="preserve">, for example 1024.</w:t>
+        </w:r>
+      </w:ins>
+    </w:p>
+    <w:p>
+      <w:pPr>
+        <w:pStyle w:val="IntenseQuote"/>
+        <w:rPr>
+          <w:ins w:id="9027" w:author="LouD" w:date="2026-10-04T12:00:00Z"/>
+        </w:rPr>
+      </w:pPr>
+      <w:ins w:id="9028" w:author="LouD" w:date="2026-10-04T12:00:00Z">
+        <w:r>
+          <w:rPr>
+            <w:b/>
+          </w:rPr>
+          <w:t>NOTE:</w:t>
+        </w:r>
+        <w:r>
+          <w:t xml:space="preserve"> The flight recorder and the WAV recording only hold the first SID.</w:t>
+        </w:r>
+      </w:ins>
+    </w:p>
+    <w:p>
+      <w:pPr>
+        <w:pStyle w:val="Heading2"/>
+        <w:rPr>
+          <w:ins w:id="9029" w:author="LouD" w:date="2026-10-04T12:00:00Z"/>
+        </w:rPr>
+      </w:pPr>
+      <w:ins w:id="9030" w:author="LouD" w:date="2026-10-04T12:00:00Z">
+        <w:r>
+          <w:t xml:space="preserve">Stereo</w:t>
+        </w:r>
+      </w:ins>
+    </w:p>
+    <w:p>
+      <w:pPr>
+        <w:rPr>
+          <w:ins w:id="9031" w:author="LouD" w:date="2026-10-04T12:00:00Z"/>
+        </w:rPr>
+      </w:pPr>
+      <w:ins w:id="9032" w:author="LouD" w:date="2026-10-04T12:00:00Z">
+        <w:r>
+          <w:t xml:space="preserve">The reSID emulation can play every SID on the left, in the center or on the right. Every tune stores its own stereo panning, saved in the SF2 file.</w:t>
+        </w:r>
+      </w:ins>
+    </w:p>
+    <w:p>
+      <w:pPr>
+        <w:rPr>
+          <w:ins w:id="9033" w:author="LouD" w:date="2026-10-04T12:00:00Z"/>
+        </w:rPr>
+      </w:pPr>
+      <w:ins w:id="9034" w:author="LouD" w:date="2026-10-04T12:00:00Z">
+        <w:r>
+          <w:t xml:space="preserve">For a multi SID tune, the panning uses the layouts and modes of the SID file format v5. The layout is Standard, L/C/R, Center first or Fully centered, the mode is Direct, Reverse, Group or Spread. A single SID tune plays in the center, on the left or on the right.</w:t>
+        </w:r>
+      </w:ins>
+    </w:p>
+    <w:p>
+      <w:pPr>
+        <w:rPr>
+          <w:ins w:id="9035" w:author="LouD" w:date="2026-10-04T12:00:00Z"/>
+        </w:rPr>
+      </w:pPr>
+      <w:ins w:id="9036" w:author="LouD" w:date="2026-10-04T12:00:00Z">
+        <w:r>
+          <w:rPr>
+            <w:b/>
+            <w:color w:val="003399"/>
+          </w:rPr>
+          <w:t xml:space="preserve">Ctrl+F9</w:t>
+        </w:r>
+        <w:r>
+          <w:t xml:space="preserve"> cycles the layout (for a single SID tune: the position), </w:t>
+        </w:r>
+        <w:r>
+          <w:rPr>
+            <w:b/>
+            <w:color w:val="003399"/>
+          </w:rPr>
+          <w:t xml:space="preserve">Ctrl+Shift+F9</w:t>
+        </w:r>
+        <w:r>
+          <w:t xml:space="preserve"> cycles the mode. You can also left click the </w:t>
+        </w:r>
+        <w:r>
+          <w:rPr>
+            <w:i/>
+            <w:iCs/>
+          </w:rPr>
+          <w:t xml:space="preserve">Pan</w:t>
+        </w:r>
+        <w:r>
+          <w:t xml:space="preserve"> field in the status bar for the layout, or </w:t>
+        </w:r>
+        <w:r>
+          <w:rPr>
+            <w:b/>
+            <w:color w:val="003399"/>
+          </w:rPr>
+          <w:t xml:space="preserve">Ctrl</w:t>
+        </w:r>
+        <w:r>
+          <w:t xml:space="preserve">+click it for the mode. The field shows where every SID plays.</w:t>
+        </w:r>
+      </w:ins>
+    </w:p>
+    <w:p>
+      <w:pPr>
+        <w:rPr>
+          <w:ins w:id="9037" w:author="LouD" w:date="2026-10-04T12:00:00Z"/>
+        </w:rPr>
+      </w:pPr>
+      <w:ins w:id="9038" w:author="LouD" w:date="2026-10-04T12:00:00Z">
+        <w:r>
+          <w:t xml:space="preserve">Tunes without a stored panning play their SIDs alternating left and right. Fully centered gives the mono mix. The output switches to stereo only while a SID plays on the left or the right.</w:t>
+        </w:r>
+      </w:ins>
+    </w:p>
+    <w:p>
+      <w:pPr>
+        <w:pStyle w:val="IntenseQuote"/>
+        <w:rPr>
+          <w:ins w:id="9039" w:author="LouD" w:date="2026-10-04T12:00:00Z"/>
+        </w:rPr>
+      </w:pPr>
+      <w:ins w:id="9040" w:author="LouD" w:date="2026-10-04T12:00:00Z">
+        <w:r>
+          <w:rPr>
+            <w:b/>
+          </w:rPr>
+          <w:t>NOTE:</w:t>
+        </w:r>
+        <w:r>
+          <w:t xml:space="preserve"> Older versions of SID Factory II can load tunes with a stored panning, they ignore it.</w:t>
+        </w:r>
+      </w:ins>
     </w:p>
     <w:p>
       <w:pPr>
@@ -6961,6 +7519,30 @@
     </w:p>
     <w:p>
       <w:pPr>
+        <w:rPr>
+          <w:ins w:id="9041" w:author="LouD" w:date="2026-10-04T12:00:00Z"/>
+        </w:rPr>
+      </w:pPr>
+      <w:ins w:id="9042" w:author="LouD" w:date="2026-10-04T12:00:00Z">
+        <w:r>
+          <w:t xml:space="preserve">When you save a multi SID tune as a SID file, the dialog also asks for the file format and the stereo panning. PSID v3/v4 holds up to 3 SIDs, the SID file format v5 holds all 4 SIDs, the panning and the play time of every song. A 4 SID tune is always saved as SID v5. The panning you choose is stored in the tune and is also used by reSID.</w:t>
+        </w:r>
+      </w:ins>
+    </w:p>
+    <w:p>
+      <w:pPr>
+        <w:rPr>
+          <w:ins w:id="9043" w:author="LouD" w:date="2026-10-04T12:00:00Z"/>
+        </w:rPr>
+      </w:pPr>
+      <w:ins w:id="9044" w:author="LouD" w:date="2026-10-04T12:00:00Z">
+        <w:r>
+          <w:t xml:space="preserve">The play time of a song is found by playing it until every track starts over or the song stops. A song that does not end within 99:59 is saved without play times.</w:t>
+        </w:r>
+      </w:ins>
+    </w:p>
+    <w:p>
+      <w:pPr>
         <w:pStyle w:val="Heading2"/>
       </w:pPr>
       <w:bookmarkStart w:id="25" w:name="_Toc224371850"/>
@@ -7048,8 +7630,33 @@
         <w:t>to</w:t>
       </w:r>
       <w:r>
-        <w:t>ggle between ASID and the reSID emulator.</w:t>
-      </w:r>
+        <w:t xml:space="preserve">ggle </w:t>
+      </w:r>
+      <w:del w:id="9076" w:author="LouD" w:date="2026-10-04T12:00:00Z">
+        <w:r>
+          <w:delText xml:space="preserve">between ASID and the reSID emulator</w:delText>
+        </w:r>
+      </w:del>
+      <w:ins w:id="9077" w:author="LouD" w:date="2026-10-04T12:00:00Z">
+        <w:r>
+          <w:t xml:space="preserve">the output between reSID, ASID and USBSID</w:t>
+        </w:r>
+      </w:ins>
+      <w:r>
+        <w:t>.</w:t>
+      </w:r>
+    </w:p>
+    <w:p>
+      <w:pPr>
+        <w:rPr>
+          <w:ins w:id="9045" w:author="LouD" w:date="2026-10-04T12:00:00Z"/>
+        </w:rPr>
+      </w:pPr>
+      <w:ins w:id="9046" w:author="LouD" w:date="2026-10-04T12:00:00Z">
+        <w:r>
+          <w:t xml:space="preserve">With a multi SID driver, ASID sends the second, third and fourth SID with the multi SID messages of the ASID protocol. The hardware needs to support these to play more than one SID.</w:t>
+        </w:r>
+      </w:ins>
     </w:p>
     <w:p>
       <w:pPr>
@@ -7080,6 +7687,208 @@
     </w:p>
     <w:p>
       <w:pPr>
+        <w:pStyle w:val="Heading2"/>
+        <w:rPr>
+          <w:ins w:id="9047" w:author="LouD" w:date="2026-10-04T12:00:00Z"/>
+        </w:rPr>
+      </w:pPr>
+      <w:ins w:id="9048" w:author="LouD" w:date="2026-10-04T12:00:00Z">
+        <w:r>
+          <w:t xml:space="preserve">USBSID-Pico</w:t>
+        </w:r>
+      </w:ins>
+    </w:p>
+    <w:p>
+      <w:pPr>
+        <w:rPr>
+          <w:ins w:id="9049" w:author="LouD" w:date="2026-10-04T12:00:00Z"/>
+        </w:rPr>
+      </w:pPr>
+      <w:ins w:id="9050" w:author="LouD" w:date="2026-10-04T12:00:00Z">
+        <w:r>
+          <w:t xml:space="preserve">SID Factory II can play directly on a USBSID-Pico board over USB, without MIDI. Every SID write is sent with its exact cycle distance to the previous one, and the board replays that timing.</w:t>
+        </w:r>
+      </w:ins>
+    </w:p>
+    <w:p>
+      <w:pPr>
+        <w:rPr>
+          <w:ins w:id="9051" w:author="LouD" w:date="2026-10-04T12:00:00Z"/>
+        </w:rPr>
+      </w:pPr>
+      <w:ins w:id="9052" w:author="LouD" w:date="2026-10-04T12:00:00Z">
+        <w:r>
+          <w:t xml:space="preserve">Connect the board before starting SID Factory II. While in the main editor, click the </w:t>
+        </w:r>
+        <w:r>
+          <w:rPr>
+            <w:i/>
+            <w:iCs/>
+          </w:rPr>
+          <w:t xml:space="preserve">Output</w:t>
+        </w:r>
+        <w:r>
+          <w:t xml:space="preserve"> field in the top bar (or press </w:t>
+        </w:r>
+        <w:r>
+          <w:rPr>
+            <w:b/>
+            <w:color w:val="003399"/>
+          </w:rPr>
+          <w:t xml:space="preserve">Alt+O</w:t>
+        </w:r>
+        <w:r>
+          <w:t xml:space="preserve">) to cycle between reSID, ASID and USBSID. Outputs that are not available are skipped. The board clock follows the PAL or NTSC setting of the tune.</w:t>
+        </w:r>
+      </w:ins>
+    </w:p>
+    <w:p>
+      <w:pPr>
+        <w:rPr>
+          <w:ins w:id="9053" w:author="LouD" w:date="2026-10-04T12:00:00Z"/>
+        </w:rPr>
+      </w:pPr>
+      <w:ins w:id="9054" w:author="LouD" w:date="2026-10-04T12:00:00Z">
+        <w:r>
+          <w:t xml:space="preserve">In the startup screen, press </w:t>
+        </w:r>
+        <w:r>
+          <w:rPr>
+            <w:b/>
+            <w:color w:val="003399"/>
+          </w:rPr>
+          <w:t xml:space="preserve">F3</w:t>
+        </w:r>
+        <w:r>
+          <w:t xml:space="preserve"> to choose the SID chips on the board(s) to play on. A single SID tune plays on every chosen SID, a multi SID tune plays every SID of the tune on its own SID chip. With more than one board connected, a dialog lets you choose the board(s) to use, and </w:t>
+        </w:r>
+        <w:r>
+          <w:rPr>
+            <w:b/>
+            <w:color w:val="003399"/>
+          </w:rPr>
+          <w:t xml:space="preserve">F2</w:t>
+        </w:r>
+        <w:r>
+          <w:t xml:space="preserve"> opens it again. In both dialogs, </w:t>
+        </w:r>
+        <w:r>
+          <w:rPr>
+            <w:b/>
+            <w:color w:val="003399"/>
+          </w:rPr>
+          <w:t xml:space="preserve">Space</w:t>
+        </w:r>
+        <w:r>
+          <w:t xml:space="preserve"> marks an entry and </w:t>
+        </w:r>
+        <w:r>
+          <w:rPr>
+            <w:b/>
+            <w:color w:val="003399"/>
+          </w:rPr>
+          <w:t xml:space="preserve">Enter</w:t>
+        </w:r>
+        <w:r>
+          <w:t xml:space="preserve"> confirms.</w:t>
+        </w:r>
+      </w:ins>
+    </w:p>
+    <w:p>
+      <w:pPr>
+        <w:rPr>
+          <w:ins w:id="9055" w:author="LouD" w:date="2026-10-04T12:00:00Z"/>
+        </w:rPr>
+      </w:pPr>
+      <w:ins w:id="9056" w:author="LouD" w:date="2026-10-04T12:00:00Z">
+        <w:r>
+          <w:t xml:space="preserve">To use the same boards and SIDs every time, set </w:t>
+        </w:r>
+        <w:r>
+          <w:rPr>
+            <w:i/>
+            <w:iCs/>
+          </w:rPr>
+          <w:t xml:space="preserve">Playback.USBSID.Boards</w:t>
+        </w:r>
+        <w:r>
+          <w:t xml:space="preserve"> and </w:t>
+        </w:r>
+        <w:r>
+          <w:rPr>
+            <w:i/>
+            <w:iCs/>
+          </w:rPr>
+          <w:t xml:space="preserve">Playback.USBSID.SIDs</w:t>
+        </w:r>
+        <w:r>
+          <w:t xml:space="preserve"> in your </w:t>
+        </w:r>
+        <w:r>
+          <w:rPr>
+            <w:i/>
+            <w:iCs/>
+          </w:rPr>
+          <w:t xml:space="preserve">user.ini</w:t>
+        </w:r>
+        <w:r>
+          <w:t xml:space="preserve">. The serial numbers of the boards are written to the log at startup. Set </w:t>
+        </w:r>
+        <w:r>
+          <w:rPr>
+            <w:i/>
+            <w:iCs/>
+          </w:rPr>
+          <w:t xml:space="preserve">Playback.USBSID.AllSIDs</w:t>
+        </w:r>
+        <w:r>
+          <w:t xml:space="preserve"> to 1 to play on every SID of the boards. </w:t>
+        </w:r>
+        <w:r>
+          <w:rPr>
+            <w:i/>
+            <w:iCs/>
+          </w:rPr>
+          <w:t xml:space="preserve">Playback.USBSID.LeadTime</w:t>
+        </w:r>
+        <w:r>
+          <w:t xml:space="preserve"> is the time in milliseconds the board plays behind the editor (30 by default).</w:t>
+        </w:r>
+      </w:ins>
+    </w:p>
+    <w:p>
+      <w:pPr>
+        <w:pStyle w:val="IntenseQuote"/>
+        <w:rPr>
+          <w:ins w:id="9057" w:author="LouD" w:date="2026-10-04T12:00:00Z"/>
+        </w:rPr>
+      </w:pPr>
+      <w:ins w:id="9058" w:author="LouD" w:date="2026-10-04T12:00:00Z">
+        <w:r>
+          <w:rPr>
+            <w:b/>
+          </w:rPr>
+          <w:t>NOTE:</w:t>
+        </w:r>
+        <w:r>
+          <w:t xml:space="preserve"> On Windows, the "USBSID-Pico Data" interface of the board needs the WinUSB driver, which you can install with Zadig. On Linux, your user needs access to the USB device; the USBSID-Pico documentation has a udev rule for this.</w:t>
+        </w:r>
+      </w:ins>
+    </w:p>
+    <w:p>
+      <w:pPr>
+        <w:rPr>
+          <w:ins w:id="9059" w:author="LouD" w:date="2026-10-04T12:00:00Z"/>
+        </w:rPr>
+      </w:pPr>
+      <w:ins w:id="9060" w:author="LouD" w:date="2026-10-04T12:00:00Z">
+        <w:r>
+          <w:t xml:space="preserve">To learn more about USBSID-Pico, please go to: https://github.com/LouDnl/USBSID-Pico</w:t>
+        </w:r>
+      </w:ins>
+    </w:p>
+    <w:p>
+      <w:pPr>
         <w:pStyle w:val="Heading1"/>
       </w:pPr>
       <w:bookmarkStart w:id="26" w:name="_Toc224371851"/>
@@ -7209,6 +8018,28 @@
       <w:r>
         <w:t>the most important keys along with detailed information about the table values for the current driver.</w:t>
       </w:r>
+    </w:p>
+    <w:p>
+      <w:pPr>
+        <w:rPr>
+          <w:ins w:id="9061" w:author="LouD" w:date="2026-10-04T12:00:00Z"/>
+        </w:rPr>
+      </w:pPr>
+      <w:ins w:id="9062" w:author="LouD" w:date="2026-10-04T12:00:00Z">
+        <w:r>
+          <w:t xml:space="preserve">Press </w:t>
+        </w:r>
+        <w:r>
+          <w:rPr>
+            <w:b/>
+            <w:color w:val="003399"/>
+          </w:rPr>
+          <w:t xml:space="preserve">Ctrl+F12</w:t>
+        </w:r>
+        <w:r>
+          <w:t xml:space="preserve"> to step the window width through the widths for 1, 2, 3 and 4 SIDs.</w:t>
+        </w:r>
+      </w:ins>
     </w:p>
     <w:p>
       <w:r>
@@ -7273,6 +8104,54 @@
       <w:r>
         <w:t>selects the MIDI output device for the ASID protocol (this requires external hardware).</w:t>
       </w:r>
+    </w:p>
+    <w:p>
+      <w:pPr>
+        <w:pStyle w:val="ListParagraph"/>
+        <w:numPr>
+          <w:ilvl w:val="0"/>
+          <w:numId w:val="1"/>
+        </w:numPr>
+        <w:rPr>
+          <w:ins w:id="9063" w:author="LouD" w:date="2026-10-04T12:00:00Z"/>
+        </w:rPr>
+      </w:pPr>
+      <w:ins w:id="9064" w:author="LouD" w:date="2026-10-04T12:00:00Z">
+        <w:r>
+          <w:rPr>
+            <w:b/>
+            <w:color w:val="003399"/>
+          </w:rPr>
+          <w:t xml:space="preserve">F2</w:t>
+        </w:r>
+        <w:r>
+          <w:t xml:space="preserve"> selects the USBSID-Pico board(s) to use, if more than one board is connected.</w:t>
+        </w:r>
+      </w:ins>
+    </w:p>
+    <w:p>
+      <w:pPr>
+        <w:pStyle w:val="ListParagraph"/>
+        <w:numPr>
+          <w:ilvl w:val="0"/>
+          <w:numId w:val="1"/>
+        </w:numPr>
+        <w:rPr>
+          <w:ins w:id="9065" w:author="LouD" w:date="2026-10-04T12:00:00Z"/>
+        </w:rPr>
+      </w:pPr>
+      <w:ins w:id="9066" w:author="LouD" w:date="2026-10-04T12:00:00Z">
+        <w:r>
+          <w:rPr>
+            <w:b/>
+            <w:color w:val="003399"/>
+          </w:rPr>
+          <w:t xml:space="preserve">F3</w:t>
+        </w:r>
+        <w:r>
+          <w:t xml:space="preserve"> selects the SID chips on the USBSID-Pico board(s) to play on.</w:t>
+        </w:r>
+      </w:ins>
     </w:p>
     <w:p>
       <w:pPr>
@@ -7958,6 +8837,60 @@
       <w:r>
         <w:t xml:space="preserve"> turns voice tracks on or off.</w:t>
       </w:r>
+    </w:p>
+    <w:p>
+      <w:pPr>
+        <w:pStyle w:val="ListParagraph"/>
+        <w:numPr>
+          <w:ilvl w:val="0"/>
+          <w:numId w:val="1"/>
+        </w:numPr>
+        <w:rPr>
+          <w:ins w:id="9067" w:author="LouD" w:date="2026-10-04T12:00:00Z"/>
+        </w:rPr>
+      </w:pPr>
+      <w:ins w:id="9068" w:author="LouD" w:date="2026-10-04T12:00:00Z">
+        <w:r>
+          <w:rPr>
+            <w:b/>
+            <w:color w:val="003399"/>
+          </w:rPr>
+          <w:t xml:space="preserve">Ctrl+4</w:t>
+        </w:r>
+        <w:r>
+          <w:t xml:space="preserve"> to </w:t>
+        </w:r>
+        <w:r>
+          <w:rPr>
+            <w:b/>
+            <w:color w:val="003399"/>
+          </w:rPr>
+          <w:t xml:space="preserve">Ctrl+9</w:t>
+        </w:r>
+        <w:r>
+          <w:t xml:space="preserve"> and </w:t>
+        </w:r>
+        <w:r>
+          <w:rPr>
+            <w:b/>
+            <w:color w:val="003399"/>
+          </w:rPr>
+          <w:t xml:space="preserve">Ctrl+Shift+1</w:t>
+        </w:r>
+        <w:r>
+          <w:t xml:space="preserve"> to </w:t>
+        </w:r>
+        <w:r>
+          <w:rPr>
+            <w:b/>
+            <w:color w:val="003399"/>
+          </w:rPr>
+          <w:t xml:space="preserve">Ctrl+Shift+3</w:t>
+        </w:r>
+        <w:r>
+          <w:t xml:space="preserve"> turn track 4 to 12 on or off (multi SID drivers).</w:t>
+        </w:r>
+      </w:ins>
     </w:p>
     <w:p>
       <w:pPr>
@@ -9662,8 +10595,93 @@
         <w:t xml:space="preserve"> </w:t>
       </w:r>
       <w:r>
-        <w:t>toggles between ASID or reSID emulator (only works if you are utilizing ASID).</w:t>
-      </w:r>
+        <w:t xml:space="preserve">toggles </w:t>
+      </w:r>
+      <w:del w:id="9078" w:author="LouD" w:date="2026-10-04T12:00:00Z">
+        <w:r>
+          <w:delText xml:space="preserve">between ASID or reSID emulator (only works if you are utilizing ASID)</w:delText>
+        </w:r>
+      </w:del>
+      <w:ins w:id="9079" w:author="LouD" w:date="2026-10-04T12:00:00Z">
+        <w:r>
+          <w:t xml:space="preserve">the output between reSID, ASID and USBSID-Pico (only the ones that are available)</w:t>
+        </w:r>
+      </w:ins>
+      <w:r>
+        <w:t>.</w:t>
+      </w:r>
+    </w:p>
+    <w:p>
+      <w:pPr>
+        <w:pStyle w:val="ListParagraph"/>
+        <w:numPr>
+          <w:ilvl w:val="0"/>
+          <w:numId w:val="1"/>
+        </w:numPr>
+        <w:rPr>
+          <w:ins w:id="9069" w:author="LouD" w:date="2026-10-04T12:00:00Z"/>
+        </w:rPr>
+      </w:pPr>
+      <w:ins w:id="9070" w:author="LouD" w:date="2026-10-04T12:00:00Z">
+        <w:r>
+          <w:rPr>
+            <w:b/>
+            <w:color w:val="003399"/>
+          </w:rPr>
+          <w:t xml:space="preserve">Ctrl+F9</w:t>
+        </w:r>
+        <w:r>
+          <w:t xml:space="preserve"> cycles the stereo panning layout (single SID: the position).</w:t>
+        </w:r>
+      </w:ins>
+    </w:p>
+    <w:p>
+      <w:pPr>
+        <w:pStyle w:val="ListParagraph"/>
+        <w:numPr>
+          <w:ilvl w:val="0"/>
+          <w:numId w:val="1"/>
+        </w:numPr>
+        <w:rPr>
+          <w:ins w:id="9071" w:author="LouD" w:date="2026-10-04T12:00:00Z"/>
+        </w:rPr>
+      </w:pPr>
+      <w:ins w:id="9072" w:author="LouD" w:date="2026-10-04T12:00:00Z">
+        <w:r>
+          <w:rPr>
+            <w:b/>
+            <w:color w:val="003399"/>
+          </w:rPr>
+          <w:t xml:space="preserve">Ctrl+Shift+F9</w:t>
+        </w:r>
+        <w:r>
+          <w:t xml:space="preserve"> cycles the stereo panning mode of a multi SID tune.</w:t>
+        </w:r>
+      </w:ins>
+    </w:p>
+    <w:p>
+      <w:pPr>
+        <w:pStyle w:val="ListParagraph"/>
+        <w:numPr>
+          <w:ilvl w:val="0"/>
+          <w:numId w:val="1"/>
+        </w:numPr>
+        <w:rPr>
+          <w:ins w:id="9073" w:author="LouD" w:date="2026-10-04T12:00:00Z"/>
+        </w:rPr>
+      </w:pPr>
+      <w:ins w:id="9074" w:author="LouD" w:date="2026-10-04T12:00:00Z">
+        <w:r>
+          <w:rPr>
+            <w:b/>
+            <w:color w:val="003399"/>
+          </w:rPr>
+          <w:t xml:space="preserve">Ctrl+F12</w:t>
+        </w:r>
+        <w:r>
+          <w:t xml:space="preserve"> steps the window width through the widths for 1, 2, 3 and 4 SIDs.</w:t>
+        </w:r>
+      </w:ins>
     </w:p>
     <w:p>
       <w:pPr>

</xml_diff>

<commit_message>
USBSID-Pico: Reconnect after unplug, SID dialog in the editor
- A board lost while USBSID is the output stops playback and switches to reSID; once every board is back, the same SIDs are opened again and the output returns to USBSID.
- Alt-Shift-O opens the SID selection in the editor, listing every SID of every connected board, also boards connected after startup.
- Driver synced with USBSID-Pico-driver 8352d70 (device lost detection, LF-only log lines).
- User manual and PR notes: Alt-Shift-O and unplug/replug.
</commit_message>
<xml_diff>
--- a/resources/user_manual.docx
+++ b/resources/user_manual.docx
@@ -4486,7 +4486,7 @@
       <w:r>
         <w:t>.</w:t>
       </w:r>
-      <w:ins w:id="9075" w:author="LouD" w:date="2026-10-04T12:00:00Z">
+      <w:ins w:id="9081" w:author="LouD" w:date="2026-10-04T12:00:00Z">
         <w:r>
           <w:t xml:space="preserve"> With a multi SID driver, use </w:t>
         </w:r>
@@ -7632,12 +7632,12 @@
       <w:r>
         <w:t xml:space="preserve">ggle </w:t>
       </w:r>
-      <w:del w:id="9076" w:author="LouD" w:date="2026-10-04T12:00:00Z">
+      <w:del w:id="9082" w:author="LouD" w:date="2026-10-04T12:00:00Z">
         <w:r>
           <w:delText xml:space="preserve">between ASID and the reSID emulator</w:delText>
         </w:r>
       </w:del>
-      <w:ins w:id="9077" w:author="LouD" w:date="2026-10-04T12:00:00Z">
+      <w:ins w:id="9083" w:author="LouD" w:date="2026-10-04T12:00:00Z">
         <w:r>
           <w:t xml:space="preserve">the output between reSID, ASID and USBSID</w:t>
         </w:r>
@@ -7802,6 +7802,40 @@
       </w:pPr>
       <w:ins w:id="9056" w:author="LouD" w:date="2026-10-04T12:00:00Z">
         <w:r>
+          <w:t xml:space="preserve">In the main editor, press </w:t>
+        </w:r>
+        <w:r>
+          <w:rPr>
+            <w:b/>
+            <w:color w:val="003399"/>
+          </w:rPr>
+          <w:t xml:space="preserve">Alt+Shift+O</w:t>
+        </w:r>
+        <w:r>
+          <w:t xml:space="preserve"> to choose the SID chips again. This stops playback and lists every SID of every connected board, also a board connected after startup.</w:t>
+        </w:r>
+      </w:ins>
+    </w:p>
+    <w:p>
+      <w:pPr>
+        <w:rPr>
+          <w:ins w:id="9057" w:author="LouD" w:date="2026-10-04T12:00:00Z"/>
+        </w:rPr>
+      </w:pPr>
+      <w:ins w:id="9058" w:author="LouD" w:date="2026-10-04T12:00:00Z">
+        <w:r>
+          <w:t xml:space="preserve">If the board is disconnected while USBSID is the output, playback stops and the output changes to reSID. When the board is connected again, it is opened with the same SID chips and the output changes back to USBSID.</w:t>
+        </w:r>
+      </w:ins>
+    </w:p>
+    <w:p>
+      <w:pPr>
+        <w:rPr>
+          <w:ins w:id="9059" w:author="LouD" w:date="2026-10-04T12:00:00Z"/>
+        </w:rPr>
+      </w:pPr>
+      <w:ins w:id="9060" w:author="LouD" w:date="2026-10-04T12:00:00Z">
+        <w:r>
           <w:t xml:space="preserve">To use the same boards and SIDs every time, set </w:t>
         </w:r>
         <w:r>
@@ -7860,10 +7894,10 @@
       <w:pPr>
         <w:pStyle w:val="IntenseQuote"/>
         <w:rPr>
-          <w:ins w:id="9057" w:author="LouD" w:date="2026-10-04T12:00:00Z"/>
-        </w:rPr>
-      </w:pPr>
-      <w:ins w:id="9058" w:author="LouD" w:date="2026-10-04T12:00:00Z">
+          <w:ins w:id="9061" w:author="LouD" w:date="2026-10-04T12:00:00Z"/>
+        </w:rPr>
+      </w:pPr>
+      <w:ins w:id="9062" w:author="LouD" w:date="2026-10-04T12:00:00Z">
         <w:r>
           <w:rPr>
             <w:b/>
@@ -7878,10 +7912,10 @@
     <w:p>
       <w:pPr>
         <w:rPr>
-          <w:ins w:id="9059" w:author="LouD" w:date="2026-10-04T12:00:00Z"/>
-        </w:rPr>
-      </w:pPr>
-      <w:ins w:id="9060" w:author="LouD" w:date="2026-10-04T12:00:00Z">
+          <w:ins w:id="9063" w:author="LouD" w:date="2026-10-04T12:00:00Z"/>
+        </w:rPr>
+      </w:pPr>
+      <w:ins w:id="9064" w:author="LouD" w:date="2026-10-04T12:00:00Z">
         <w:r>
           <w:t xml:space="preserve">To learn more about USBSID-Pico, please go to: https://github.com/LouDnl/USBSID-Pico</w:t>
         </w:r>
@@ -8022,10 +8056,10 @@
     <w:p>
       <w:pPr>
         <w:rPr>
-          <w:ins w:id="9061" w:author="LouD" w:date="2026-10-04T12:00:00Z"/>
-        </w:rPr>
-      </w:pPr>
-      <w:ins w:id="9062" w:author="LouD" w:date="2026-10-04T12:00:00Z">
+          <w:ins w:id="9065" w:author="LouD" w:date="2026-10-04T12:00:00Z"/>
+        </w:rPr>
+      </w:pPr>
+      <w:ins w:id="9066" w:author="LouD" w:date="2026-10-04T12:00:00Z">
         <w:r>
           <w:t xml:space="preserve">Press </w:t>
         </w:r>
@@ -8113,10 +8147,10 @@
           <w:numId w:val="1"/>
         </w:numPr>
         <w:rPr>
-          <w:ins w:id="9063" w:author="LouD" w:date="2026-10-04T12:00:00Z"/>
-        </w:rPr>
-      </w:pPr>
-      <w:ins w:id="9064" w:author="LouD" w:date="2026-10-04T12:00:00Z">
+          <w:ins w:id="9067" w:author="LouD" w:date="2026-10-04T12:00:00Z"/>
+        </w:rPr>
+      </w:pPr>
+      <w:ins w:id="9068" w:author="LouD" w:date="2026-10-04T12:00:00Z">
         <w:r>
           <w:rPr>
             <w:b/>
@@ -8137,10 +8171,10 @@
           <w:numId w:val="1"/>
         </w:numPr>
         <w:rPr>
-          <w:ins w:id="9065" w:author="LouD" w:date="2026-10-04T12:00:00Z"/>
-        </w:rPr>
-      </w:pPr>
-      <w:ins w:id="9066" w:author="LouD" w:date="2026-10-04T12:00:00Z">
+          <w:ins w:id="9069" w:author="LouD" w:date="2026-10-04T12:00:00Z"/>
+        </w:rPr>
+      </w:pPr>
+      <w:ins w:id="9070" w:author="LouD" w:date="2026-10-04T12:00:00Z">
         <w:r>
           <w:rPr>
             <w:b/>
@@ -8846,10 +8880,10 @@
           <w:numId w:val="1"/>
         </w:numPr>
         <w:rPr>
-          <w:ins w:id="9067" w:author="LouD" w:date="2026-10-04T12:00:00Z"/>
-        </w:rPr>
-      </w:pPr>
-      <w:ins w:id="9068" w:author="LouD" w:date="2026-10-04T12:00:00Z">
+          <w:ins w:id="9071" w:author="LouD" w:date="2026-10-04T12:00:00Z"/>
+        </w:rPr>
+      </w:pPr>
+      <w:ins w:id="9072" w:author="LouD" w:date="2026-10-04T12:00:00Z">
         <w:r>
           <w:rPr>
             <w:b/>
@@ -10597,12 +10631,12 @@
       <w:r>
         <w:t xml:space="preserve">toggles </w:t>
       </w:r>
-      <w:del w:id="9078" w:author="LouD" w:date="2026-10-04T12:00:00Z">
+      <w:del w:id="9084" w:author="LouD" w:date="2026-10-04T12:00:00Z">
         <w:r>
           <w:delText xml:space="preserve">between ASID or reSID emulator (only works if you are utilizing ASID)</w:delText>
         </w:r>
       </w:del>
-      <w:ins w:id="9079" w:author="LouD" w:date="2026-10-04T12:00:00Z">
+      <w:ins w:id="9085" w:author="LouD" w:date="2026-10-04T12:00:00Z">
         <w:r>
           <w:t xml:space="preserve">the output between reSID, ASID and USBSID-Pico (only the ones that are available)</w:t>
         </w:r>
@@ -10619,10 +10653,10 @@
           <w:numId w:val="1"/>
         </w:numPr>
         <w:rPr>
-          <w:ins w:id="9069" w:author="LouD" w:date="2026-10-04T12:00:00Z"/>
-        </w:rPr>
-      </w:pPr>
-      <w:ins w:id="9070" w:author="LouD" w:date="2026-10-04T12:00:00Z">
+          <w:ins w:id="9073" w:author="LouD" w:date="2026-10-04T12:00:00Z"/>
+        </w:rPr>
+      </w:pPr>
+      <w:ins w:id="9074" w:author="LouD" w:date="2026-10-04T12:00:00Z">
         <w:r>
           <w:rPr>
             <w:b/>
@@ -10643,10 +10677,10 @@
           <w:numId w:val="1"/>
         </w:numPr>
         <w:rPr>
-          <w:ins w:id="9071" w:author="LouD" w:date="2026-10-04T12:00:00Z"/>
-        </w:rPr>
-      </w:pPr>
-      <w:ins w:id="9072" w:author="LouD" w:date="2026-10-04T12:00:00Z">
+          <w:ins w:id="9075" w:author="LouD" w:date="2026-10-04T12:00:00Z"/>
+        </w:rPr>
+      </w:pPr>
+      <w:ins w:id="9076" w:author="LouD" w:date="2026-10-04T12:00:00Z">
         <w:r>
           <w:rPr>
             <w:b/>
@@ -10667,10 +10701,10 @@
           <w:numId w:val="1"/>
         </w:numPr>
         <w:rPr>
-          <w:ins w:id="9073" w:author="LouD" w:date="2026-10-04T12:00:00Z"/>
-        </w:rPr>
-      </w:pPr>
-      <w:ins w:id="9074" w:author="LouD" w:date="2026-10-04T12:00:00Z">
+          <w:ins w:id="9077" w:author="LouD" w:date="2026-10-04T12:00:00Z"/>
+        </w:rPr>
+      </w:pPr>
+      <w:ins w:id="9078" w:author="LouD" w:date="2026-10-04T12:00:00Z">
         <w:r>
           <w:rPr>
             <w:b/>
@@ -10680,6 +10714,30 @@
         </w:r>
         <w:r>
           <w:t xml:space="preserve"> steps the window width through the widths for 1, 2, 3 and 4 SIDs.</w:t>
+        </w:r>
+      </w:ins>
+    </w:p>
+    <w:p>
+      <w:pPr>
+        <w:pStyle w:val="ListParagraph"/>
+        <w:numPr>
+          <w:ilvl w:val="0"/>
+          <w:numId w:val="1"/>
+        </w:numPr>
+        <w:rPr>
+          <w:ins w:id="9079" w:author="LouD" w:date="2026-10-04T12:00:00Z"/>
+        </w:rPr>
+      </w:pPr>
+      <w:ins w:id="9080" w:author="LouD" w:date="2026-10-04T12:00:00Z">
+        <w:r>
+          <w:rPr>
+            <w:b/>
+            <w:color w:val="003399"/>
+          </w:rPr>
+          <w:t xml:space="preserve">Alt+Shift+O</w:t>
+        </w:r>
+        <w:r>
+          <w:t xml:space="preserve"> chooses the SID chips on the USBSID-Pico board(s) to play on.</w:t>
         </w:r>
       </w:ins>
     </w:p>

</xml_diff>